<commit_message>
Added Wireframe and Challenges and Lessons Learned
</commit_message>
<xml_diff>
--- a/Module 9.2 Group Assignment_Draft.docx
+++ b/Module 9.2 Group Assignment_Draft.docx
@@ -1357,8 +1357,18 @@
                 <w:sz w:val="28"/>
                 <w:szCs w:val="28"/>
               </w:rPr>
-              <w:t>2 hrs</w:t>
-            </w:r>
+              <w:t xml:space="preserve">2 </w:t>
+            </w:r>
+            <w:proofErr w:type="spellStart"/>
+            <w:r>
+              <w:rPr>
+                <w:rFonts w:ascii="Calibri" w:hAnsi="Calibri" w:cs="Calibri"/>
+                <w:sz w:val="28"/>
+                <w:szCs w:val="28"/>
+              </w:rPr>
+              <w:t>hrs</w:t>
+            </w:r>
+            <w:proofErr w:type="spellEnd"/>
           </w:p>
         </w:tc>
         <w:tc>
@@ -1454,8 +1464,18 @@
                 <w:sz w:val="28"/>
                 <w:szCs w:val="28"/>
               </w:rPr>
-              <w:t>4 hrs</w:t>
-            </w:r>
+              <w:t xml:space="preserve">4 </w:t>
+            </w:r>
+            <w:proofErr w:type="spellStart"/>
+            <w:r>
+              <w:rPr>
+                <w:rFonts w:ascii="Calibri" w:hAnsi="Calibri" w:cs="Calibri"/>
+                <w:sz w:val="28"/>
+                <w:szCs w:val="28"/>
+              </w:rPr>
+              <w:t>hrs</w:t>
+            </w:r>
+            <w:proofErr w:type="spellEnd"/>
           </w:p>
         </w:tc>
         <w:tc>
@@ -1552,8 +1572,18 @@
                 <w:sz w:val="28"/>
                 <w:szCs w:val="28"/>
               </w:rPr>
-              <w:t>6 hrs</w:t>
-            </w:r>
+              <w:t xml:space="preserve">6 </w:t>
+            </w:r>
+            <w:proofErr w:type="spellStart"/>
+            <w:r>
+              <w:rPr>
+                <w:rFonts w:ascii="Calibri" w:hAnsi="Calibri" w:cs="Calibri"/>
+                <w:sz w:val="28"/>
+                <w:szCs w:val="28"/>
+              </w:rPr>
+              <w:t>hrs</w:t>
+            </w:r>
+            <w:proofErr w:type="spellEnd"/>
           </w:p>
         </w:tc>
         <w:tc>
@@ -1649,8 +1679,18 @@
                 <w:sz w:val="28"/>
                 <w:szCs w:val="28"/>
               </w:rPr>
-              <w:t>5 hrs</w:t>
-            </w:r>
+              <w:t xml:space="preserve">5 </w:t>
+            </w:r>
+            <w:proofErr w:type="spellStart"/>
+            <w:r>
+              <w:rPr>
+                <w:rFonts w:ascii="Calibri" w:hAnsi="Calibri" w:cs="Calibri"/>
+                <w:sz w:val="28"/>
+                <w:szCs w:val="28"/>
+              </w:rPr>
+              <w:t>hrs</w:t>
+            </w:r>
+            <w:proofErr w:type="spellEnd"/>
           </w:p>
         </w:tc>
         <w:tc>
@@ -1747,8 +1787,18 @@
                 <w:sz w:val="28"/>
                 <w:szCs w:val="28"/>
               </w:rPr>
-              <w:t>2 hrs</w:t>
-            </w:r>
+              <w:t xml:space="preserve">2 </w:t>
+            </w:r>
+            <w:proofErr w:type="spellStart"/>
+            <w:r>
+              <w:rPr>
+                <w:rFonts w:ascii="Calibri" w:hAnsi="Calibri" w:cs="Calibri"/>
+                <w:sz w:val="28"/>
+                <w:szCs w:val="28"/>
+              </w:rPr>
+              <w:t>hrs</w:t>
+            </w:r>
+            <w:proofErr w:type="spellEnd"/>
           </w:p>
         </w:tc>
         <w:tc>
@@ -1844,8 +1894,18 @@
                 <w:sz w:val="28"/>
                 <w:szCs w:val="28"/>
               </w:rPr>
-              <w:t>3 hrs</w:t>
-            </w:r>
+              <w:t xml:space="preserve">3 </w:t>
+            </w:r>
+            <w:proofErr w:type="spellStart"/>
+            <w:r>
+              <w:rPr>
+                <w:rFonts w:ascii="Calibri" w:hAnsi="Calibri" w:cs="Calibri"/>
+                <w:sz w:val="28"/>
+                <w:szCs w:val="28"/>
+              </w:rPr>
+              <w:t>hrs</w:t>
+            </w:r>
+            <w:proofErr w:type="spellEnd"/>
           </w:p>
         </w:tc>
         <w:tc>
@@ -1960,8 +2020,18 @@
                 <w:sz w:val="28"/>
                 <w:szCs w:val="28"/>
               </w:rPr>
-              <w:t>3 hrs</w:t>
-            </w:r>
+              <w:t xml:space="preserve">3 </w:t>
+            </w:r>
+            <w:proofErr w:type="spellStart"/>
+            <w:r>
+              <w:rPr>
+                <w:rFonts w:ascii="Calibri" w:hAnsi="Calibri" w:cs="Calibri"/>
+                <w:sz w:val="28"/>
+                <w:szCs w:val="28"/>
+              </w:rPr>
+              <w:t>hrs</w:t>
+            </w:r>
+            <w:proofErr w:type="spellEnd"/>
           </w:p>
         </w:tc>
         <w:tc>
@@ -2350,8 +2420,18 @@
                 <w:sz w:val="28"/>
                 <w:szCs w:val="28"/>
               </w:rPr>
-              <w:t>3 hrs</w:t>
-            </w:r>
+              <w:t xml:space="preserve">3 </w:t>
+            </w:r>
+            <w:proofErr w:type="spellStart"/>
+            <w:r>
+              <w:rPr>
+                <w:rFonts w:ascii="Calibri" w:hAnsi="Calibri" w:cs="Calibri"/>
+                <w:sz w:val="28"/>
+                <w:szCs w:val="28"/>
+              </w:rPr>
+              <w:t>hrs</w:t>
+            </w:r>
+            <w:proofErr w:type="spellEnd"/>
           </w:p>
         </w:tc>
         <w:tc>
@@ -2447,8 +2527,18 @@
                 <w:sz w:val="28"/>
                 <w:szCs w:val="28"/>
               </w:rPr>
-              <w:t>6 hrs</w:t>
-            </w:r>
+              <w:t xml:space="preserve">6 </w:t>
+            </w:r>
+            <w:proofErr w:type="spellStart"/>
+            <w:r>
+              <w:rPr>
+                <w:rFonts w:ascii="Calibri" w:hAnsi="Calibri" w:cs="Calibri"/>
+                <w:sz w:val="28"/>
+                <w:szCs w:val="28"/>
+              </w:rPr>
+              <w:t>hrs</w:t>
+            </w:r>
+            <w:proofErr w:type="spellEnd"/>
           </w:p>
         </w:tc>
         <w:tc>
@@ -2545,8 +2635,18 @@
                 <w:sz w:val="28"/>
                 <w:szCs w:val="28"/>
               </w:rPr>
-              <w:t>4 hrs</w:t>
-            </w:r>
+              <w:t xml:space="preserve">4 </w:t>
+            </w:r>
+            <w:proofErr w:type="spellStart"/>
+            <w:r>
+              <w:rPr>
+                <w:rFonts w:ascii="Calibri" w:hAnsi="Calibri" w:cs="Calibri"/>
+                <w:sz w:val="28"/>
+                <w:szCs w:val="28"/>
+              </w:rPr>
+              <w:t>hrs</w:t>
+            </w:r>
+            <w:proofErr w:type="spellEnd"/>
           </w:p>
         </w:tc>
         <w:tc>
@@ -2651,8 +2751,18 @@
                 <w:sz w:val="28"/>
                 <w:szCs w:val="28"/>
               </w:rPr>
-              <w:t>4 hrs</w:t>
-            </w:r>
+              <w:t xml:space="preserve">4 </w:t>
+            </w:r>
+            <w:proofErr w:type="spellStart"/>
+            <w:r>
+              <w:rPr>
+                <w:rFonts w:ascii="Calibri" w:hAnsi="Calibri" w:cs="Calibri"/>
+                <w:sz w:val="28"/>
+                <w:szCs w:val="28"/>
+              </w:rPr>
+              <w:t>hrs</w:t>
+            </w:r>
+            <w:proofErr w:type="spellEnd"/>
           </w:p>
         </w:tc>
         <w:tc>
@@ -2758,8 +2868,18 @@
                 <w:sz w:val="28"/>
                 <w:szCs w:val="28"/>
               </w:rPr>
-              <w:t>3 hrs</w:t>
-            </w:r>
+              <w:t xml:space="preserve">3 </w:t>
+            </w:r>
+            <w:proofErr w:type="spellStart"/>
+            <w:r>
+              <w:rPr>
+                <w:rFonts w:ascii="Calibri" w:hAnsi="Calibri" w:cs="Calibri"/>
+                <w:sz w:val="28"/>
+                <w:szCs w:val="28"/>
+              </w:rPr>
+              <w:t>hrs</w:t>
+            </w:r>
+            <w:proofErr w:type="spellEnd"/>
           </w:p>
         </w:tc>
         <w:tc>
@@ -2855,8 +2975,18 @@
                 <w:sz w:val="28"/>
                 <w:szCs w:val="28"/>
               </w:rPr>
-              <w:t>2 hrs</w:t>
-            </w:r>
+              <w:t xml:space="preserve">2 </w:t>
+            </w:r>
+            <w:proofErr w:type="spellStart"/>
+            <w:r>
+              <w:rPr>
+                <w:rFonts w:ascii="Calibri" w:hAnsi="Calibri" w:cs="Calibri"/>
+                <w:sz w:val="28"/>
+                <w:szCs w:val="28"/>
+              </w:rPr>
+              <w:t>hrs</w:t>
+            </w:r>
+            <w:proofErr w:type="spellEnd"/>
           </w:p>
         </w:tc>
         <w:tc>
@@ -2953,8 +3083,18 @@
                 <w:sz w:val="28"/>
                 <w:szCs w:val="28"/>
               </w:rPr>
-              <w:t>3 hrs</w:t>
-            </w:r>
+              <w:t xml:space="preserve">3 </w:t>
+            </w:r>
+            <w:proofErr w:type="spellStart"/>
+            <w:r>
+              <w:rPr>
+                <w:rFonts w:ascii="Calibri" w:hAnsi="Calibri" w:cs="Calibri"/>
+                <w:sz w:val="28"/>
+                <w:szCs w:val="28"/>
+              </w:rPr>
+              <w:t>hrs</w:t>
+            </w:r>
+            <w:proofErr w:type="spellEnd"/>
           </w:p>
         </w:tc>
         <w:tc>
@@ -3201,7 +3341,24 @@
           <w:szCs w:val="28"/>
         </w:rPr>
         <w:noBreakHyphen/>
-        <w:t>Us’s expansion into grooming, training, and boarding services. Because it directly supports customer engagement and revenue generation, the team agreed it was the most appropriate functionality to visualize.</w:t>
+      </w:r>
+      <w:proofErr w:type="spellStart"/>
+      <w:r>
+        <w:rPr>
+          <w:rFonts w:ascii="Calibri" w:hAnsi="Calibri" w:cs="Calibri"/>
+          <w:sz w:val="28"/>
+          <w:szCs w:val="28"/>
+        </w:rPr>
+        <w:t>Us’s</w:t>
+      </w:r>
+      <w:proofErr w:type="spellEnd"/>
+      <w:r>
+        <w:rPr>
+          <w:rFonts w:ascii="Calibri" w:hAnsi="Calibri" w:cs="Calibri"/>
+          <w:sz w:val="28"/>
+          <w:szCs w:val="28"/>
+        </w:rPr>
+        <w:t xml:space="preserve"> expansion into grooming, training, and boarding services. Because it directly supports customer engagement and revenue generation, the team agreed it was the most appropriate functionality to visualize.</w:t>
       </w:r>
     </w:p>
     <w:p>
@@ -3607,6 +3764,7 @@
           <w:rFonts w:ascii="Calibri" w:hAnsi="Calibri" w:cs="Calibri"/>
           <w:b/>
           <w:bCs/>
+          <w:noProof/>
           <w:sz w:val="28"/>
           <w:szCs w:val="28"/>
         </w:rPr>
@@ -3646,6 +3804,91 @@
           </wp:inline>
         </w:drawing>
       </w:r>
+    </w:p>
+    <w:p>
+      <w:pPr>
+        <w:rPr>
+          <w:rFonts w:ascii="Calibri" w:hAnsi="Calibri" w:cs="Calibri"/>
+          <w:b/>
+          <w:bCs/>
+          <w:sz w:val="28"/>
+          <w:szCs w:val="28"/>
+        </w:rPr>
+      </w:pPr>
+      <w:r>
+        <w:rPr>
+          <w:rFonts w:ascii="Calibri" w:hAnsi="Calibri" w:cs="Calibri"/>
+          <w:b/>
+          <w:bCs/>
+          <w:sz w:val="28"/>
+          <w:szCs w:val="28"/>
+        </w:rPr>
+        <w:lastRenderedPageBreak/>
+        <w:t>Challenges and Lessons Learned</w:t>
+      </w:r>
+    </w:p>
+    <w:p>
+      <w:pPr>
+        <w:rPr>
+          <w:rFonts w:ascii="Calibri" w:hAnsi="Calibri" w:cs="Calibri"/>
+          <w:sz w:val="28"/>
+          <w:szCs w:val="28"/>
+        </w:rPr>
+      </w:pPr>
+      <w:r>
+        <w:rPr>
+          <w:rFonts w:ascii="Calibri" w:hAnsi="Calibri" w:cs="Calibri"/>
+          <w:sz w:val="28"/>
+          <w:szCs w:val="28"/>
+        </w:rPr>
+        <w:t xml:space="preserve">One of the most significant challenges our team faced during this project was coordinating our schedules. Because our team members </w:t>
+      </w:r>
+      <w:proofErr w:type="gramStart"/>
+      <w:r>
+        <w:rPr>
+          <w:rFonts w:ascii="Calibri" w:hAnsi="Calibri" w:cs="Calibri"/>
+          <w:sz w:val="28"/>
+          <w:szCs w:val="28"/>
+        </w:rPr>
+        <w:t>are located in</w:t>
+      </w:r>
+      <w:proofErr w:type="gramEnd"/>
+      <w:r>
+        <w:rPr>
+          <w:rFonts w:ascii="Calibri" w:hAnsi="Calibri" w:cs="Calibri"/>
+          <w:sz w:val="28"/>
+          <w:szCs w:val="28"/>
+        </w:rPr>
+        <w:t xml:space="preserve"> different time zones and have busy daily routines, finding overlapping times to meet and collaborate on activities was very difficult.</w:t>
+      </w:r>
+    </w:p>
+    <w:p>
+      <w:pPr>
+        <w:rPr>
+          <w:rFonts w:ascii="Calibri" w:hAnsi="Calibri" w:cs="Calibri"/>
+          <w:sz w:val="28"/>
+          <w:szCs w:val="28"/>
+        </w:rPr>
+      </w:pPr>
+      <w:r>
+        <w:rPr>
+          <w:rFonts w:ascii="Calibri" w:hAnsi="Calibri" w:cs="Calibri"/>
+          <w:sz w:val="28"/>
+          <w:szCs w:val="28"/>
+        </w:rPr>
+        <w:t>This challenge taught us a valuable lesson about the importance of proactive and clear communication. I learned that to succeed in teamwork, especially in a remote or asynchronous environment, team members must communicate their availability early, set clear expectations, and stay organized. By keeping each other updated and actively coordinating our efforts, we were able to overcome our scheduling conflicts and successfully complete the project.</w:t>
+      </w:r>
+    </w:p>
+    <w:p>
+      <w:pPr>
+        <w:rPr>
+          <w:rFonts w:ascii="Calibri" w:hAnsi="Calibri" w:cs="Calibri"/>
+          <w:b/>
+          <w:bCs/>
+          <w:sz w:val="28"/>
+          <w:szCs w:val="28"/>
+        </w:rPr>
+      </w:pPr>
     </w:p>
     <w:sectPr>
       <w:pgSz w:w="12240" w:h="15840"/>

</xml_diff>

<commit_message>
Add Calendar in wireframe
I added calendar in wireframe and how it will look in a big screen and small screen
</commit_message>
<xml_diff>
--- a/Module 9.2 Group Assignment_Draft.docx
+++ b/Module 9.2 Group Assignment_Draft.docx
@@ -1,6 +1,6 @@
 
 <file path=word/document.xml><?xml version="1.0" encoding="utf-8"?>
-<w:document xmlns:wpc="http://schemas.microsoft.com/office/word/2010/wordprocessingCanvas" xmlns:cx="http://schemas.microsoft.com/office/drawing/2014/chartex" xmlns:cx1="http://schemas.microsoft.com/office/drawing/2015/9/8/chartex" xmlns:cx2="http://schemas.microsoft.com/office/drawing/2015/10/21/chartex" xmlns:cx3="http://schemas.microsoft.com/office/drawing/2016/5/9/chartex" xmlns:cx4="http://schemas.microsoft.com/office/drawing/2016/5/10/chartex" xmlns:cx5="http://schemas.microsoft.com/office/drawing/2016/5/11/chartex" xmlns:cx6="http://schemas.microsoft.com/office/drawing/2016/5/12/chartex" xmlns:cx7="http://schemas.microsoft.com/office/drawing/2016/5/13/chartex" xmlns:cx8="http://schemas.microsoft.com/office/drawing/2016/5/14/chartex" xmlns:mc="http://schemas.openxmlformats.org/markup-compatibility/2006" xmlns:aink="http://schemas.microsoft.com/office/drawing/2016/ink" xmlns:am3d="http://schemas.microsoft.com/office/drawing/2017/model3d" xmlns:o="urn:schemas-microsoft-com:office:office" xmlns:oel="http://schemas.microsoft.com/office/2019/extlst" xmlns:r="http://schemas.openxmlformats.org/officeDocument/2006/relationships" xmlns:m="http://schemas.openxmlformats.org/officeDocument/2006/math" xmlns:v="urn:schemas-microsoft-com:vml" xmlns:wp14="http://schemas.microsoft.com/office/word/2010/wordprocessingDrawing" xmlns:wp="http://schemas.openxmlformats.org/drawingml/2006/wordprocessingDrawing" xmlns:w10="urn:schemas-microsoft-com:office:word" xmlns:w="http://schemas.openxmlformats.org/wordprocessingml/2006/main" xmlns:w14="http://schemas.microsoft.com/office/word/2010/wordml" xmlns:w15="http://schemas.microsoft.com/office/word/2012/wordml" xmlns:w16cex="http://schemas.microsoft.com/office/word/2018/wordml/cex" xmlns:w16cid="http://schemas.microsoft.com/office/word/2016/wordml/cid" xmlns:w16="http://schemas.microsoft.com/office/word/2018/wordml" xmlns:w16sdtdh="http://schemas.microsoft.com/office/word/2020/wordml/sdtdatahash" xmlns:w16se="http://schemas.microsoft.com/office/word/2015/wordml/symex" xmlns:wpg="http://schemas.microsoft.com/office/word/2010/wordprocessingGroup" xmlns:wpi="http://schemas.microsoft.com/office/word/2010/wordprocessingInk" xmlns:wne="http://schemas.microsoft.com/office/word/2006/wordml" xmlns:wps="http://schemas.microsoft.com/office/word/2010/wordprocessingShape" mc:Ignorable="w14 w15 w16se w16cid w16 w16cex w16sdtdh wp14">
+<w:document xmlns:wpc="http://schemas.microsoft.com/office/word/2010/wordprocessingCanvas" xmlns:cx="http://schemas.microsoft.com/office/drawing/2014/chartex" xmlns:cx1="http://schemas.microsoft.com/office/drawing/2015/9/8/chartex" xmlns:cx2="http://schemas.microsoft.com/office/drawing/2015/10/21/chartex" xmlns:cx3="http://schemas.microsoft.com/office/drawing/2016/5/9/chartex" xmlns:cx4="http://schemas.microsoft.com/office/drawing/2016/5/10/chartex" xmlns:cx5="http://schemas.microsoft.com/office/drawing/2016/5/11/chartex" xmlns:cx6="http://schemas.microsoft.com/office/drawing/2016/5/12/chartex" xmlns:cx7="http://schemas.microsoft.com/office/drawing/2016/5/13/chartex" xmlns:cx8="http://schemas.microsoft.com/office/drawing/2016/5/14/chartex" xmlns:mc="http://schemas.openxmlformats.org/markup-compatibility/2006" xmlns:aink="http://schemas.microsoft.com/office/drawing/2016/ink" xmlns:am3d="http://schemas.microsoft.com/office/drawing/2017/model3d" xmlns:o="urn:schemas-microsoft-com:office:office" xmlns:oel="http://schemas.microsoft.com/office/2019/extlst" xmlns:r="http://schemas.openxmlformats.org/officeDocument/2006/relationships" xmlns:m="http://schemas.openxmlformats.org/officeDocument/2006/math" xmlns:v="urn:schemas-microsoft-com:vml" xmlns:wp14="http://schemas.microsoft.com/office/word/2010/wordprocessingDrawing" xmlns:wp="http://schemas.openxmlformats.org/drawingml/2006/wordprocessingDrawing" xmlns:w10="urn:schemas-microsoft-com:office:word" xmlns:w="http://schemas.openxmlformats.org/wordprocessingml/2006/main" xmlns:w14="http://schemas.microsoft.com/office/word/2010/wordml" xmlns:w15="http://schemas.microsoft.com/office/word/2012/wordml" xmlns:w16cex="http://schemas.microsoft.com/office/word/2018/wordml/cex" xmlns:w16cid="http://schemas.microsoft.com/office/word/2016/wordml/cid" xmlns:w16="http://schemas.microsoft.com/office/word/2018/wordml" xmlns:w16du="http://schemas.microsoft.com/office/word/2023/wordml/word16du" xmlns:w16sdtdh="http://schemas.microsoft.com/office/word/2020/wordml/sdtdatahash" xmlns:w16sdtfl="http://schemas.microsoft.com/office/word/2024/wordml/sdtformatlock" xmlns:w16se="http://schemas.microsoft.com/office/word/2015/wordml/symex" xmlns:wpg="http://schemas.microsoft.com/office/word/2010/wordprocessingGroup" xmlns:wpi="http://schemas.microsoft.com/office/word/2010/wordprocessingInk" xmlns:wne="http://schemas.microsoft.com/office/word/2006/wordml" xmlns:wps="http://schemas.microsoft.com/office/word/2010/wordprocessingShape" mc:Ignorable="w14 w15 w16se w16cid w16 w16cex w16sdtdh w16sdtfl w16du wp14">
   <w:body>
     <w:p>
       <w:pPr>
@@ -454,6 +454,7 @@
           <w:sz w:val="28"/>
           <w:szCs w:val="28"/>
         </w:rPr>
+        <w:lastRenderedPageBreak/>
         <w:t>Activity 1- User Story Elicitation</w:t>
       </w:r>
     </w:p>
@@ -779,6 +780,7 @@
           <w:sz w:val="28"/>
           <w:szCs w:val="28"/>
         </w:rPr>
+        <w:lastRenderedPageBreak/>
         <w:t>7. Groomer Daily Schedule View</w:t>
       </w:r>
     </w:p>
@@ -1068,6 +1070,7 @@
           <w:sz w:val="28"/>
           <w:szCs w:val="28"/>
         </w:rPr>
+        <w:lastRenderedPageBreak/>
         <w:t>Activity 2 -Task Breakdown and Estimation</w:t>
       </w:r>
     </w:p>
@@ -2156,6 +2159,7 @@
           <w:sz w:val="28"/>
           <w:szCs w:val="28"/>
         </w:rPr>
+        <w:lastRenderedPageBreak/>
         <w:t>Story 2 (Priority 2): Accurate Real</w:t>
       </w:r>
       <w:r>
@@ -3253,6 +3257,7 @@
           <w:sz w:val="28"/>
           <w:szCs w:val="28"/>
         </w:rPr>
+        <w:lastRenderedPageBreak/>
         <w:t>Activity 3 — Wireframes (Formatted for Final Document)</w:t>
       </w:r>
     </w:p>
@@ -3717,6 +3722,7 @@
           <w:sz w:val="28"/>
           <w:szCs w:val="28"/>
         </w:rPr>
+        <w:lastRenderedPageBreak/>
         <w:t>Final Wireframe</w:t>
       </w:r>
     </w:p>
@@ -3735,38 +3741,14 @@
           <w:rFonts w:ascii="Calibri" w:hAnsi="Calibri" w:cs="Calibri"/>
           <w:b/>
           <w:bCs/>
-          <w:i/>
-          <w:iCs/>
-          <w:sz w:val="28"/>
-          <w:szCs w:val="28"/>
-        </w:rPr>
-        <w:t>(Insert your team’s final wireframe image here.)</w:t>
-      </w:r>
-    </w:p>
-    <w:p>
-      <w:pPr>
-        <w:rPr>
-          <w:rFonts w:ascii="Calibri" w:hAnsi="Calibri" w:cs="Calibri"/>
-          <w:b/>
-          <w:bCs/>
-          <w:sz w:val="28"/>
-          <w:szCs w:val="28"/>
-        </w:rPr>
-      </w:pPr>
-      <w:r>
-        <w:rPr>
-          <w:rFonts w:ascii="Calibri" w:hAnsi="Calibri" w:cs="Calibri"/>
-          <w:b/>
-          <w:bCs/>
-          <w:noProof/>
           <w:sz w:val="28"/>
           <w:szCs w:val="28"/>
         </w:rPr>
         <w:drawing>
-          <wp:inline distT="0" distB="0" distL="0" distR="0" wp14:anchorId="3693C6B1" wp14:editId="5E3A41B3">
-            <wp:extent cx="5696745" cy="7287642"/>
+          <wp:inline distT="0" distB="0" distL="0" distR="0" wp14:anchorId="5FB73010" wp14:editId="0E9AE70A">
+            <wp:extent cx="5943600" cy="2924810"/>
             <wp:effectExtent l="0" t="0" r="0" b="8890"/>
-            <wp:docPr id="1948913871" name="Picture 1"/>
+            <wp:docPr id="520489456" name="Picture 1"/>
             <wp:cNvGraphicFramePr>
               <a:graphicFrameLocks xmlns:a="http://schemas.openxmlformats.org/drawingml/2006/main" noChangeAspect="1"/>
             </wp:cNvGraphicFramePr>
@@ -3774,7 +3756,7 @@
               <a:graphicData uri="http://schemas.openxmlformats.org/drawingml/2006/picture">
                 <pic:pic xmlns:pic="http://schemas.openxmlformats.org/drawingml/2006/picture">
                   <pic:nvPicPr>
-                    <pic:cNvPr id="1948913871" name=""/>
+                    <pic:cNvPr id="520489456" name=""/>
                     <pic:cNvPicPr/>
                   </pic:nvPicPr>
                   <pic:blipFill>
@@ -3786,7 +3768,7 @@
                   <pic:spPr>
                     <a:xfrm>
                       <a:off x="0" y="0"/>
-                      <a:ext cx="5696745" cy="7287642"/>
+                      <a:ext cx="5943600" cy="2924810"/>
                     </a:xfrm>
                     <a:prstGeom prst="rect">
                       <a:avLst/>
@@ -3809,25 +3791,71 @@
           <w:szCs w:val="28"/>
         </w:rPr>
       </w:pPr>
-    </w:p>
-    <w:p>
-      <w:pPr>
-        <w:rPr>
-          <w:rFonts w:ascii="Calibri" w:hAnsi="Calibri" w:cs="Calibri"/>
-          <w:b/>
-          <w:bCs/>
-          <w:sz w:val="28"/>
-          <w:szCs w:val="28"/>
-        </w:rPr>
-      </w:pPr>
-      <w:r>
-        <w:rPr>
-          <w:rFonts w:ascii="Calibri" w:hAnsi="Calibri" w:cs="Calibri"/>
-          <w:b/>
-          <w:bCs/>
-          <w:sz w:val="28"/>
-          <w:szCs w:val="28"/>
-        </w:rPr>
+      <w:r>
+        <w:rPr>
+          <w:rFonts w:ascii="Calibri" w:hAnsi="Calibri" w:cs="Calibri"/>
+          <w:b/>
+          <w:bCs/>
+          <w:sz w:val="28"/>
+          <w:szCs w:val="28"/>
+        </w:rPr>
+        <w:drawing>
+          <wp:inline distT="0" distB="0" distL="0" distR="0" wp14:anchorId="6360319C" wp14:editId="2EA48F03">
+            <wp:extent cx="2018110" cy="4105275"/>
+            <wp:effectExtent l="0" t="0" r="1270" b="0"/>
+            <wp:docPr id="995213174" name="Picture 1"/>
+            <wp:cNvGraphicFramePr>
+              <a:graphicFrameLocks xmlns:a="http://schemas.openxmlformats.org/drawingml/2006/main" noChangeAspect="1"/>
+            </wp:cNvGraphicFramePr>
+            <a:graphic xmlns:a="http://schemas.openxmlformats.org/drawingml/2006/main">
+              <a:graphicData uri="http://schemas.openxmlformats.org/drawingml/2006/picture">
+                <pic:pic xmlns:pic="http://schemas.openxmlformats.org/drawingml/2006/picture">
+                  <pic:nvPicPr>
+                    <pic:cNvPr id="995213174" name=""/>
+                    <pic:cNvPicPr/>
+                  </pic:nvPicPr>
+                  <pic:blipFill>
+                    <a:blip r:embed="rId6"/>
+                    <a:stretch>
+                      <a:fillRect/>
+                    </a:stretch>
+                  </pic:blipFill>
+                  <pic:spPr>
+                    <a:xfrm>
+                      <a:off x="0" y="0"/>
+                      <a:ext cx="2020056" cy="4109234"/>
+                    </a:xfrm>
+                    <a:prstGeom prst="rect">
+                      <a:avLst/>
+                    </a:prstGeom>
+                  </pic:spPr>
+                </pic:pic>
+              </a:graphicData>
+            </a:graphic>
+          </wp:inline>
+        </w:drawing>
+      </w:r>
+    </w:p>
+    <w:p>
+      <w:pPr>
+        <w:rPr>
+          <w:rFonts w:ascii="Calibri" w:hAnsi="Calibri" w:cs="Calibri"/>
+          <w:b/>
+          <w:bCs/>
+          <w:sz w:val="28"/>
+          <w:szCs w:val="28"/>
+        </w:rPr>
+      </w:pPr>
+      <w:r>
+        <w:rPr>
+          <w:rFonts w:ascii="Calibri" w:hAnsi="Calibri" w:cs="Calibri"/>
+          <w:b/>
+          <w:bCs/>
+          <w:noProof/>
+          <w:sz w:val="28"/>
+          <w:szCs w:val="28"/>
+        </w:rPr>
+        <w:lastRenderedPageBreak/>
         <w:drawing>
           <wp:inline distT="0" distB="0" distL="0" distR="0" wp14:anchorId="23D4E049" wp14:editId="7F6D42E6">
             <wp:extent cx="5384768" cy="8087710"/>
@@ -3844,7 +3872,7 @@
                     <pic:cNvPicPr/>
                   </pic:nvPicPr>
                   <pic:blipFill>
-                    <a:blip r:embed="rId6"/>
+                    <a:blip r:embed="rId7"/>
                     <a:stretch>
                       <a:fillRect/>
                     </a:stretch>
@@ -3883,6 +3911,7 @@
           <w:sz w:val="28"/>
           <w:szCs w:val="28"/>
         </w:rPr>
+        <w:lastRenderedPageBreak/>
         <w:t>Challenges and Lessons Learned</w:t>
       </w:r>
     </w:p>
@@ -3942,7 +3971,7 @@
 </file>
 
 <file path=word/numbering.xml><?xml version="1.0" encoding="utf-8"?>
-<w:numbering xmlns:wpc="http://schemas.microsoft.com/office/word/2010/wordprocessingCanvas" xmlns:cx="http://schemas.microsoft.com/office/drawing/2014/chartex" xmlns:cx1="http://schemas.microsoft.com/office/drawing/2015/9/8/chartex" xmlns:cx2="http://schemas.microsoft.com/office/drawing/2015/10/21/chartex" xmlns:cx3="http://schemas.microsoft.com/office/drawing/2016/5/9/chartex" xmlns:cx4="http://schemas.microsoft.com/office/drawing/2016/5/10/chartex" xmlns:cx5="http://schemas.microsoft.com/office/drawing/2016/5/11/chartex" xmlns:cx6="http://schemas.microsoft.com/office/drawing/2016/5/12/chartex" xmlns:cx7="http://schemas.microsoft.com/office/drawing/2016/5/13/chartex" xmlns:cx8="http://schemas.microsoft.com/office/drawing/2016/5/14/chartex" xmlns:mc="http://schemas.openxmlformats.org/markup-compatibility/2006" xmlns:aink="http://schemas.microsoft.com/office/drawing/2016/ink" xmlns:am3d="http://schemas.microsoft.com/office/drawing/2017/model3d" xmlns:o="urn:schemas-microsoft-com:office:office" xmlns:oel="http://schemas.microsoft.com/office/2019/extlst" xmlns:r="http://schemas.openxmlformats.org/officeDocument/2006/relationships" xmlns:m="http://schemas.openxmlformats.org/officeDocument/2006/math" xmlns:v="urn:schemas-microsoft-com:vml" xmlns:wp14="http://schemas.microsoft.com/office/word/2010/wordprocessingDrawing" xmlns:wp="http://schemas.openxmlformats.org/drawingml/2006/wordprocessingDrawing" xmlns:w10="urn:schemas-microsoft-com:office:word" xmlns:w="http://schemas.openxmlformats.org/wordprocessingml/2006/main" xmlns:w14="http://schemas.microsoft.com/office/word/2010/wordml" xmlns:w15="http://schemas.microsoft.com/office/word/2012/wordml" xmlns:w16cex="http://schemas.microsoft.com/office/word/2018/wordml/cex" xmlns:w16cid="http://schemas.microsoft.com/office/word/2016/wordml/cid" xmlns:w16="http://schemas.microsoft.com/office/word/2018/wordml" xmlns:w16sdtdh="http://schemas.microsoft.com/office/word/2020/wordml/sdtdatahash" xmlns:w16se="http://schemas.microsoft.com/office/word/2015/wordml/symex" xmlns:wpg="http://schemas.microsoft.com/office/word/2010/wordprocessingGroup" xmlns:wpi="http://schemas.microsoft.com/office/word/2010/wordprocessingInk" xmlns:wne="http://schemas.microsoft.com/office/word/2006/wordml" xmlns:wps="http://schemas.microsoft.com/office/word/2010/wordprocessingShape" mc:Ignorable="w14 w15 w16se w16cid w16 w16cex w16sdtdh wp14">
+<w:numbering xmlns:wpc="http://schemas.microsoft.com/office/word/2010/wordprocessingCanvas" xmlns:cx="http://schemas.microsoft.com/office/drawing/2014/chartex" xmlns:cx1="http://schemas.microsoft.com/office/drawing/2015/9/8/chartex" xmlns:cx2="http://schemas.microsoft.com/office/drawing/2015/10/21/chartex" xmlns:cx3="http://schemas.microsoft.com/office/drawing/2016/5/9/chartex" xmlns:cx4="http://schemas.microsoft.com/office/drawing/2016/5/10/chartex" xmlns:cx5="http://schemas.microsoft.com/office/drawing/2016/5/11/chartex" xmlns:cx6="http://schemas.microsoft.com/office/drawing/2016/5/12/chartex" xmlns:cx7="http://schemas.microsoft.com/office/drawing/2016/5/13/chartex" xmlns:cx8="http://schemas.microsoft.com/office/drawing/2016/5/14/chartex" xmlns:mc="http://schemas.openxmlformats.org/markup-compatibility/2006" xmlns:aink="http://schemas.microsoft.com/office/drawing/2016/ink" xmlns:am3d="http://schemas.microsoft.com/office/drawing/2017/model3d" xmlns:o="urn:schemas-microsoft-com:office:office" xmlns:oel="http://schemas.microsoft.com/office/2019/extlst" xmlns:r="http://schemas.openxmlformats.org/officeDocument/2006/relationships" xmlns:m="http://schemas.openxmlformats.org/officeDocument/2006/math" xmlns:v="urn:schemas-microsoft-com:vml" xmlns:wp14="http://schemas.microsoft.com/office/word/2010/wordprocessingDrawing" xmlns:wp="http://schemas.openxmlformats.org/drawingml/2006/wordprocessingDrawing" xmlns:w10="urn:schemas-microsoft-com:office:word" xmlns:w="http://schemas.openxmlformats.org/wordprocessingml/2006/main" xmlns:w14="http://schemas.microsoft.com/office/word/2010/wordml" xmlns:w15="http://schemas.microsoft.com/office/word/2012/wordml" xmlns:w16cex="http://schemas.microsoft.com/office/word/2018/wordml/cex" xmlns:w16cid="http://schemas.microsoft.com/office/word/2016/wordml/cid" xmlns:w16="http://schemas.microsoft.com/office/word/2018/wordml" xmlns:w16du="http://schemas.microsoft.com/office/word/2023/wordml/word16du" xmlns:w16sdtdh="http://schemas.microsoft.com/office/word/2020/wordml/sdtdatahash" xmlns:w16sdtfl="http://schemas.microsoft.com/office/word/2024/wordml/sdtformatlock" xmlns:w16se="http://schemas.microsoft.com/office/word/2015/wordml/symex" xmlns:wpg="http://schemas.microsoft.com/office/word/2010/wordprocessingGroup" xmlns:wpi="http://schemas.microsoft.com/office/word/2010/wordprocessingInk" xmlns:wne="http://schemas.microsoft.com/office/word/2006/wordml" xmlns:wps="http://schemas.microsoft.com/office/word/2010/wordprocessingShape" mc:Ignorable="w14 w15 w16se w16cid w16 w16cex w16sdtdh w16sdtfl w16du wp14">
   <w:abstractNum w:abstractNumId="0" w15:restartNumberingAfterBreak="0">
     <w:nsid w:val="00C065F1"/>
     <w:multiLevelType w:val="hybridMultilevel"/>
@@ -4846,7 +4875,7 @@
 </file>
 
 <file path=word/styles.xml><?xml version="1.0" encoding="utf-8"?>
-<w:styles xmlns:mc="http://schemas.openxmlformats.org/markup-compatibility/2006" xmlns:r="http://schemas.openxmlformats.org/officeDocument/2006/relationships" xmlns:w="http://schemas.openxmlformats.org/wordprocessingml/2006/main" xmlns:w14="http://schemas.microsoft.com/office/word/2010/wordml" xmlns:w15="http://schemas.microsoft.com/office/word/2012/wordml" xmlns:w16cex="http://schemas.microsoft.com/office/word/2018/wordml/cex" xmlns:w16cid="http://schemas.microsoft.com/office/word/2016/wordml/cid" xmlns:w16="http://schemas.microsoft.com/office/word/2018/wordml" xmlns:w16sdtdh="http://schemas.microsoft.com/office/word/2020/wordml/sdtdatahash" xmlns:w16se="http://schemas.microsoft.com/office/word/2015/wordml/symex" mc:Ignorable="w14 w15 w16se w16cid w16 w16cex w16sdtdh">
+<w:styles xmlns:mc="http://schemas.openxmlformats.org/markup-compatibility/2006" xmlns:r="http://schemas.openxmlformats.org/officeDocument/2006/relationships" xmlns:w="http://schemas.openxmlformats.org/wordprocessingml/2006/main" xmlns:w14="http://schemas.microsoft.com/office/word/2010/wordml" xmlns:w15="http://schemas.microsoft.com/office/word/2012/wordml" xmlns:w16cex="http://schemas.microsoft.com/office/word/2018/wordml/cex" xmlns:w16cid="http://schemas.microsoft.com/office/word/2016/wordml/cid" xmlns:w16="http://schemas.microsoft.com/office/word/2018/wordml" xmlns:w16du="http://schemas.microsoft.com/office/word/2023/wordml/word16du" xmlns:w16sdtdh="http://schemas.microsoft.com/office/word/2020/wordml/sdtdatahash" xmlns:w16sdtfl="http://schemas.microsoft.com/office/word/2024/wordml/sdtformatlock" xmlns:w16se="http://schemas.microsoft.com/office/word/2015/wordml/symex" mc:Ignorable="w14 w15 w16se w16cid w16 w16cex w16sdtdh w16sdtfl w16du">
   <w:docDefaults>
     <w:rPrDefault>
       <w:rPr>

</xml_diff>